<commit_message>
fix: modifed to use args
</commit_message>
<xml_diff>
--- a/output/cmp_infra_check_2026_W08.docx
+++ b/output/cmp_infra_check_2026_W08.docx
@@ -16,7 +16,7 @@
         <w:jc w:val="center"/>
       </w:pPr>
       <w:r>
-        <w:t>생성일시: 2026-02-19 15:39:14</w:t>
+        <w:t>생성일시: 2026-02-20 13:35:45</w:t>
         <w:br/>
       </w:r>
       <w:r>
@@ -155,7 +155,7 @@
                 <w:b/>
                 <w:color w:val="008000"/>
               </w:rPr>
-              <w:t>80</w:t>
+              <w:t>82</w:t>
             </w:r>
           </w:p>
         </w:tc>
@@ -172,7 +172,7 @@
                 <w:b/>
                 <w:color w:val="FFA500"/>
               </w:rPr>
-              <w:t>3</w:t>
+              <w:t>2</w:t>
             </w:r>
           </w:p>
         </w:tc>
@@ -189,7 +189,7 @@
                 <w:b/>
                 <w:color w:val="FF0000"/>
               </w:rPr>
-              <w:t>6</w:t>
+              <w:t>5</w:t>
             </w:r>
           </w:p>
         </w:tc>
@@ -406,7 +406,7 @@
               <w:jc w:val="center"/>
             </w:pPr>
             <w:r>
-              <w:t>79</w:t>
+              <w:t>81</w:t>
             </w:r>
           </w:p>
         </w:tc>
@@ -419,7 +419,7 @@
               <w:jc w:val="center"/>
             </w:pPr>
             <w:r>
-              <w:t>2</w:t>
+              <w:t>1</w:t>
             </w:r>
           </w:p>
         </w:tc>
@@ -432,7 +432,7 @@
               <w:jc w:val="center"/>
             </w:pPr>
             <w:r>
-              <w:t>6</w:t>
+              <w:t>5</w:t>
             </w:r>
           </w:p>
         </w:tc>
@@ -712,7 +712,7 @@
               <w:jc w:val="center"/>
             </w:pPr>
             <w:r>
-              <w:t>26</w:t>
+              <w:t>27</w:t>
             </w:r>
           </w:p>
         </w:tc>
@@ -725,7 +725,7 @@
               <w:jc w:val="center"/>
             </w:pPr>
             <w:r>
-              <w:t>1</w:t>
+              <w:t>0</w:t>
             </w:r>
           </w:p>
         </w:tc>
@@ -779,7 +779,7 @@
               <w:jc w:val="center"/>
             </w:pPr>
             <w:r>
-              <w:t>6</w:t>
+              <w:t>7</w:t>
             </w:r>
           </w:p>
         </w:tc>
@@ -805,7 +805,7 @@
               <w:jc w:val="center"/>
             </w:pPr>
             <w:r>
-              <w:t>1</w:t>
+              <w:t>0</w:t>
             </w:r>
           </w:p>
         </w:tc>
@@ -1732,7 +1732,7 @@
           </w:tcPr>
           <w:p>
             <w:r>
-              <w:t>갱신 필요 (59일 남음)</w:t>
+              <w:t>갱신 필요 (58일 남음)</w:t>
             </w:r>
           </w:p>
         </w:tc>
@@ -1788,7 +1788,7 @@
           </w:tcPr>
           <w:p>
             <w:r>
-              <w:t>정상 (84일 남음)</w:t>
+              <w:t>정상 (83일 남음)</w:t>
             </w:r>
           </w:p>
         </w:tc>
@@ -1947,7 +1947,7 @@
           </w:tcPr>
           <w:p>
             <w:r>
-              <w:t>39</w:t>
+              <w:t>41</w:t>
             </w:r>
           </w:p>
         </w:tc>
@@ -2003,7 +2003,7 @@
           </w:tcPr>
           <w:p>
             <w:r>
-              <w:t>26.0</w:t>
+              <w:t>25.5</w:t>
             </w:r>
           </w:p>
         </w:tc>
@@ -2059,7 +2059,7 @@
           </w:tcPr>
           <w:p>
             <w:r>
-              <w:t>5</w:t>
+              <w:t>8</w:t>
             </w:r>
           </w:p>
         </w:tc>
@@ -2115,7 +2115,7 @@
           </w:tcPr>
           <w:p>
             <w:r>
-              <w:t>up 4 weeks, 3 days, 4 hours, 3...</w:t>
+              <w:t>up 4 weeks, 4 days, 2 hours, 2...</w:t>
             </w:r>
           </w:p>
         </w:tc>
@@ -2227,7 +2227,7 @@
           </w:tcPr>
           <w:p>
             <w:r>
-              <w:t>0.35</w:t>
+              <w:t>0.34</w:t>
             </w:r>
           </w:p>
         </w:tc>
@@ -2339,7 +2339,7 @@
           </w:tcPr>
           <w:p>
             <w:r>
-              <w:t>1167</w:t>
+              <w:t>1160</w:t>
             </w:r>
           </w:p>
         </w:tc>
@@ -2451,7 +2451,7 @@
           </w:tcPr>
           <w:p>
             <w:r>
-              <w:t>42</w:t>
+              <w:t>43</w:t>
             </w:r>
           </w:p>
         </w:tc>
@@ -2507,7 +2507,7 @@
           </w:tcPr>
           <w:p>
             <w:r>
-              <w:t>25.5</w:t>
+              <w:t>26.4</w:t>
             </w:r>
           </w:p>
         </w:tc>
@@ -2563,7 +2563,7 @@
           </w:tcPr>
           <w:p>
             <w:r>
-              <w:t>1</w:t>
+              <w:t>2</w:t>
             </w:r>
           </w:p>
         </w:tc>
@@ -2619,7 +2619,7 @@
           </w:tcPr>
           <w:p>
             <w:r>
-              <w:t>up 4 weeks, 3 days, 5 hours, 4...</w:t>
+              <w:t>up 4 weeks, 4 days, 3 hours</w:t>
             </w:r>
           </w:p>
         </w:tc>
@@ -2731,7 +2731,7 @@
           </w:tcPr>
           <w:p>
             <w:r>
-              <w:t>0.36</w:t>
+              <w:t>1.60</w:t>
             </w:r>
           </w:p>
         </w:tc>
@@ -2787,7 +2787,7 @@
           </w:tcPr>
           <w:p>
             <w:r>
-              <w:t>2912</w:t>
+              <w:t>2656</w:t>
             </w:r>
           </w:p>
         </w:tc>
@@ -2843,7 +2843,7 @@
           </w:tcPr>
           <w:p>
             <w:r>
-              <w:t>1175</w:t>
+              <w:t>1180</w:t>
             </w:r>
           </w:p>
         </w:tc>
@@ -2955,7 +2955,7 @@
           </w:tcPr>
           <w:p>
             <w:r>
-              <w:t>41</w:t>
+              <w:t>46</w:t>
             </w:r>
           </w:p>
         </w:tc>
@@ -3011,7 +3011,7 @@
           </w:tcPr>
           <w:p>
             <w:r>
-              <w:t>23.8</w:t>
+              <w:t>24.5</w:t>
             </w:r>
           </w:p>
         </w:tc>
@@ -3123,7 +3123,7 @@
           </w:tcPr>
           <w:p>
             <w:r>
-              <w:t>up 4 weeks, 3 days, 4 hours, 4...</w:t>
+              <w:t>up 4 weeks, 4 days, 2 hours, 4...</w:t>
             </w:r>
           </w:p>
         </w:tc>
@@ -3235,7 +3235,7 @@
           </w:tcPr>
           <w:p>
             <w:r>
-              <w:t>1.17</w:t>
+              <w:t>0.26</w:t>
             </w:r>
           </w:p>
         </w:tc>
@@ -3291,7 +3291,7 @@
           </w:tcPr>
           <w:p>
             <w:r>
-              <w:t>2656</w:t>
+              <w:t>2720</w:t>
             </w:r>
           </w:p>
         </w:tc>
@@ -3347,7 +3347,7 @@
           </w:tcPr>
           <w:p>
             <w:r>
-              <w:t>1168</w:t>
+              <w:t>1172</w:t>
             </w:r>
           </w:p>
         </w:tc>
@@ -3564,7 +3564,7 @@
           </w:tcPr>
           <w:p>
             <w:r>
-              <w:t>52</w:t>
+              <w:t>53</w:t>
             </w:r>
           </w:p>
         </w:tc>
@@ -3620,7 +3620,7 @@
           </w:tcPr>
           <w:p>
             <w:r>
-              <w:t>19.5</w:t>
+              <w:t>22.0</w:t>
             </w:r>
           </w:p>
         </w:tc>
@@ -3676,7 +3676,7 @@
           </w:tcPr>
           <w:p>
             <w:r>
-              <w:t>1</w:t>
+              <w:t>2</w:t>
             </w:r>
           </w:p>
         </w:tc>
@@ -3732,7 +3732,7 @@
           </w:tcPr>
           <w:p>
             <w:r>
-              <w:t>up 4 hours, 41 minutes</w:t>
+              <w:t>up 1 day, 2 hours, 37 minutes</w:t>
             </w:r>
           </w:p>
         </w:tc>
@@ -3844,7 +3844,7 @@
           </w:tcPr>
           <w:p>
             <w:r>
-              <w:t>0.57</w:t>
+              <w:t>1.61</w:t>
             </w:r>
           </w:p>
         </w:tc>
@@ -3900,7 +3900,7 @@
           </w:tcPr>
           <w:p>
             <w:r>
-              <w:t>12576</w:t>
+              <w:t>12544</w:t>
             </w:r>
           </w:p>
         </w:tc>
@@ -4056,29 +4056,29 @@
             <w:r>
               <w:rPr>
                 <w:b/>
-                <w:color w:val="FFA500"/>
+                <w:color w:val="008000"/>
               </w:rPr>
-              <w:t>경고</w:t>
-            </w:r>
-          </w:p>
-        </w:tc>
-        <w:tc>
-          <w:tcPr>
-            <w:tcW w:type="dxa" w:w="1728"/>
-          </w:tcPr>
-          <w:p>
-            <w:r>
-              <w:t>65</w:t>
-            </w:r>
-          </w:p>
-        </w:tc>
-        <w:tc>
-          <w:tcPr>
-            <w:tcW w:type="dxa" w:w="1728"/>
-          </w:tcPr>
-          <w:p>
-            <w:r>
-              <w:t>임계치 근접 (65.0% / 80%)</w:t>
+              <w:t>정상</w:t>
+            </w:r>
+          </w:p>
+        </w:tc>
+        <w:tc>
+          <w:tcPr>
+            <w:tcW w:type="dxa" w:w="1728"/>
+          </w:tcPr>
+          <w:p>
+            <w:r>
+              <w:t>66</w:t>
+            </w:r>
+          </w:p>
+        </w:tc>
+        <w:tc>
+          <w:tcPr>
+            <w:tcW w:type="dxa" w:w="1728"/>
+          </w:tcPr>
+          <w:p>
+            <w:r>
+              <w:t>정상 범위</w:t>
             </w:r>
           </w:p>
         </w:tc>
@@ -4124,7 +4124,7 @@
           </w:tcPr>
           <w:p>
             <w:r>
-              <w:t>48.6</w:t>
+              <w:t>51.5</w:t>
             </w:r>
           </w:p>
         </w:tc>
@@ -4180,7 +4180,7 @@
           </w:tcPr>
           <w:p>
             <w:r>
-              <w:t>1</w:t>
+              <w:t>9</w:t>
             </w:r>
           </w:p>
         </w:tc>
@@ -4236,7 +4236,7 @@
           </w:tcPr>
           <w:p>
             <w:r>
-              <w:t>up 4 weeks, 3 days, 6 hours, 1...</w:t>
+              <w:t>up 4 weeks, 4 days, 4 hours, 1...</w:t>
             </w:r>
           </w:p>
         </w:tc>
@@ -4348,7 +4348,7 @@
           </w:tcPr>
           <w:p>
             <w:r>
-              <w:t>1.35</w:t>
+              <w:t>1.91</w:t>
             </w:r>
           </w:p>
         </w:tc>
@@ -4460,7 +4460,7 @@
           </w:tcPr>
           <w:p>
             <w:r>
-              <w:t>45</w:t>
+              <w:t>44</w:t>
             </w:r>
           </w:p>
         </w:tc>
@@ -4628,7 +4628,7 @@
           </w:tcPr>
           <w:p>
             <w:r>
-              <w:t>24.2</w:t>
+              <w:t>26.3</w:t>
             </w:r>
           </w:p>
         </w:tc>
@@ -4684,7 +4684,7 @@
           </w:tcPr>
           <w:p>
             <w:r>
-              <w:t>2</w:t>
+              <w:t>14</w:t>
             </w:r>
           </w:p>
         </w:tc>
@@ -4740,7 +4740,7 @@
           </w:tcPr>
           <w:p>
             <w:r>
-              <w:t>up 4 hours, 44 minutes</w:t>
+              <w:t>up 1 day, 2 hours, 40 minutes</w:t>
             </w:r>
           </w:p>
         </w:tc>
@@ -4852,7 +4852,7 @@
           </w:tcPr>
           <w:p>
             <w:r>
-              <w:t>0.56</w:t>
+              <w:t>2.02</w:t>
             </w:r>
           </w:p>
         </w:tc>
@@ -4908,7 +4908,7 @@
           </w:tcPr>
           <w:p>
             <w:r>
-              <w:t>4416</w:t>
+              <w:t>4480</w:t>
             </w:r>
           </w:p>
         </w:tc>
@@ -5239,7 +5239,7 @@
           </w:tcPr>
           <w:p>
             <w:r>
-              <w:t>gpu-master-01:7</w:t>
+              <w:t>gpu-master-01:6</w:t>
               <w:br/>
               <w:t>gpu-master-02:...</w:t>
             </w:r>
@@ -5297,7 +5297,7 @@
           </w:tcPr>
           <w:p>
             <w:r>
-              <w:t>gpu-master-01:29</w:t>
+              <w:t>gpu-master-01:28</w:t>
               <w:br/>
               <w:t>gpu-master-02...</w:t>
             </w:r>
@@ -5399,29 +5399,29 @@
             <w:r>
               <w:rPr>
                 <w:b/>
-                <w:color w:val="FF0000"/>
+                <w:color w:val="008000"/>
               </w:rPr>
-              <w:t>위험</w:t>
-            </w:r>
-          </w:p>
-        </w:tc>
-        <w:tc>
-          <w:tcPr>
-            <w:tcW w:type="dxa" w:w="1728"/>
-          </w:tcPr>
-          <w:p>
-            <w:r>
-              <w:t>82</w:t>
-            </w:r>
-          </w:p>
-        </w:tc>
-        <w:tc>
-          <w:tcPr>
-            <w:tcW w:type="dxa" w:w="1728"/>
-          </w:tcPr>
-          <w:p>
-            <w:r>
-              <w:t>즉시 조치 필요 (82.0개)</w:t>
+              <w:t>정상</w:t>
+            </w:r>
+          </w:p>
+        </w:tc>
+        <w:tc>
+          <w:tcPr>
+            <w:tcW w:type="dxa" w:w="1728"/>
+          </w:tcPr>
+          <w:p>
+            <w:r>
+              <w:t>42</w:t>
+            </w:r>
+          </w:p>
+        </w:tc>
+        <w:tc>
+          <w:tcPr>
+            <w:tcW w:type="dxa" w:w="1728"/>
+          </w:tcPr>
+          <w:p>
+            <w:r>
+              <w:t>정상 범위</w:t>
             </w:r>
           </w:p>
         </w:tc>
@@ -8186,75 +8186,11 @@
       </w:r>
       <w:r>
         <w:br/>
-        <w:t xml:space="preserve">   - 메시지: 갱신 필요 (59일 남음)</w:t>
+        <w:t xml:space="preserve">   - 메시지: 갱신 필요 (58일 남음)</w:t>
       </w:r>
       <w:r>
         <w:br/>
         <w:t xml:space="preserve">   - 중요도: high</w:t>
-      </w:r>
-    </w:p>
-    <w:p>
-      <w:r>
-        <w:rPr>
-          <w:b/>
-        </w:rPr>
-        <w:t>[경고] [OS-001] 디스크 사용량</w:t>
-      </w:r>
-      <w:r>
-        <w:br/>
-        <w:t xml:space="preserve">   - 환경: DEV</w:t>
-      </w:r>
-      <w:r>
-        <w:br/>
-        <w:t xml:space="preserve">   - 대상: Worker #2</w:t>
-      </w:r>
-      <w:r>
-        <w:br/>
-        <w:t xml:space="preserve">   - 상태: 경고</w:t>
-      </w:r>
-      <w:r>
-        <w:br/>
-        <w:t xml:space="preserve">   - 측정값: 65</w:t>
-      </w:r>
-      <w:r>
-        <w:br/>
-        <w:t xml:space="preserve">   - 메시지: 임계치 근접 (65.0% / 80%)</w:t>
-      </w:r>
-      <w:r>
-        <w:br/>
-        <w:t xml:space="preserve">   - 중요도: high</w:t>
-      </w:r>
-    </w:p>
-    <w:p>
-      <w:r>
-        <w:rPr>
-          <w:b/>
-        </w:rPr>
-        <w:t>[위험] [K8S-005] Warning 이벤트</w:t>
-      </w:r>
-      <w:r>
-        <w:br/>
-        <w:t xml:space="preserve">   - 환경: DEV</w:t>
-      </w:r>
-      <w:r>
-        <w:br/>
-        <w:t xml:space="preserve">   - 대상: DEV Cluster</w:t>
-      </w:r>
-      <w:r>
-        <w:br/>
-        <w:t xml:space="preserve">   - 상태: 위험</w:t>
-      </w:r>
-      <w:r>
-        <w:br/>
-        <w:t xml:space="preserve">   - 측정값: 82</w:t>
-      </w:r>
-      <w:r>
-        <w:br/>
-        <w:t xml:space="preserve">   - 메시지: 즉시 조치 필요 (82.0개)</w:t>
-      </w:r>
-      <w:r>
-        <w:br/>
-        <w:t xml:space="preserve">   - 중요도: medium</w:t>
       </w:r>
     </w:p>
     <w:p>
@@ -8470,7 +8406,7 @@
         <w:br/>
       </w:r>
       <w:r>
-        <w:t>점검일: 2026년 02월 19일</w:t>
+        <w:t>점검일: 2026년 02월 20일</w:t>
       </w:r>
     </w:p>
     <w:sectPr>

</xml_diff>

<commit_message>
fix: modifed os check
</commit_message>
<xml_diff>
--- a/output/cmp_infra_check_2026_W08.docx
+++ b/output/cmp_infra_check_2026_W08.docx
@@ -16,7 +16,7 @@
         <w:jc w:val="center"/>
       </w:pPr>
       <w:r>
-        <w:t>생성일시: 2026-02-20 13:35:45</w:t>
+        <w:t>생성일시: 2026-02-20 17:21:49</w:t>
         <w:br/>
       </w:r>
       <w:r>
@@ -138,7 +138,7 @@
               <w:jc w:val="center"/>
             </w:pPr>
             <w:r>
-              <w:t>89</w:t>
+              <w:t>95</w:t>
             </w:r>
           </w:p>
         </w:tc>
@@ -189,7 +189,7 @@
                 <w:b/>
                 <w:color w:val="FF0000"/>
               </w:rPr>
-              <w:t>5</w:t>
+              <w:t>11</w:t>
             </w:r>
           </w:p>
         </w:tc>
@@ -326,7 +326,7 @@
               <w:jc w:val="center"/>
             </w:pPr>
             <w:r>
-              <w:t>인증서</w:t>
+              <w:t>CI/CD 인프라</w:t>
             </w:r>
           </w:p>
         </w:tc>
@@ -339,7 +339,7 @@
               <w:jc w:val="center"/>
             </w:pPr>
             <w:r>
-              <w:t>1</w:t>
+              <w:t>0</w:t>
             </w:r>
           </w:p>
         </w:tc>
@@ -352,7 +352,7 @@
               <w:jc w:val="center"/>
             </w:pPr>
             <w:r>
-              <w:t>1</w:t>
+              <w:t>0</w:t>
             </w:r>
           </w:p>
         </w:tc>
@@ -365,7 +365,7 @@
               <w:jc w:val="center"/>
             </w:pPr>
             <w:r>
-              <w:t>0</w:t>
+              <w:t>6</w:t>
             </w:r>
           </w:p>
         </w:tc>
@@ -393,7 +393,74 @@
               <w:jc w:val="center"/>
             </w:pPr>
             <w:r>
-              <w:t>DEV</w:t>
+              <w:t>인증서</w:t>
+            </w:r>
+          </w:p>
+        </w:tc>
+        <w:tc>
+          <w:tcPr>
+            <w:tcW w:type="dxa" w:w="1728"/>
+          </w:tcPr>
+          <w:p>
+            <w:pPr>
+              <w:jc w:val="center"/>
+            </w:pPr>
+            <w:r>
+              <w:t>1</w:t>
+            </w:r>
+          </w:p>
+        </w:tc>
+        <w:tc>
+          <w:tcPr>
+            <w:tcW w:type="dxa" w:w="1728"/>
+          </w:tcPr>
+          <w:p>
+            <w:pPr>
+              <w:jc w:val="center"/>
+            </w:pPr>
+            <w:r>
+              <w:t>1</w:t>
+            </w:r>
+          </w:p>
+        </w:tc>
+        <w:tc>
+          <w:tcPr>
+            <w:tcW w:type="dxa" w:w="1728"/>
+          </w:tcPr>
+          <w:p>
+            <w:pPr>
+              <w:jc w:val="center"/>
+            </w:pPr>
+            <w:r>
+              <w:t>0</w:t>
+            </w:r>
+          </w:p>
+        </w:tc>
+        <w:tc>
+          <w:tcPr>
+            <w:tcW w:type="dxa" w:w="1728"/>
+          </w:tcPr>
+          <w:p>
+            <w:pPr>
+              <w:jc w:val="center"/>
+            </w:pPr>
+            <w:r>
+              <w:t>0</w:t>
+            </w:r>
+          </w:p>
+        </w:tc>
+      </w:tr>
+      <w:tr>
+        <w:tc>
+          <w:tcPr>
+            <w:tcW w:type="dxa" w:w="1728"/>
+          </w:tcPr>
+          <w:p>
+            <w:pPr>
+              <w:jc w:val="center"/>
+            </w:pPr>
+            <w:r>
+              <w:t>GPU</w:t>
             </w:r>
           </w:p>
         </w:tc>
@@ -565,7 +632,7 @@
               <w:jc w:val="center"/>
             </w:pPr>
             <w:r>
-              <w:t>SSL</w:t>
+              <w:t>CI/CD</w:t>
             </w:r>
           </w:p>
         </w:tc>
@@ -578,7 +645,7 @@
               <w:jc w:val="center"/>
             </w:pPr>
             <w:r>
-              <w:t>1</w:t>
+              <w:t>0</w:t>
             </w:r>
           </w:p>
         </w:tc>
@@ -591,7 +658,7 @@
               <w:jc w:val="center"/>
             </w:pPr>
             <w:r>
-              <w:t>1</w:t>
+              <w:t>0</w:t>
             </w:r>
           </w:p>
         </w:tc>
@@ -604,7 +671,7 @@
               <w:jc w:val="center"/>
             </w:pPr>
             <w:r>
-              <w:t>0</w:t>
+              <w:t>6</w:t>
             </w:r>
           </w:p>
         </w:tc>
@@ -632,7 +699,7 @@
               <w:jc w:val="center"/>
             </w:pPr>
             <w:r>
-              <w:t>DEV Master</w:t>
+              <w:t>SSL</w:t>
             </w:r>
           </w:p>
         </w:tc>
@@ -645,7 +712,7 @@
               <w:jc w:val="center"/>
             </w:pPr>
             <w:r>
-              <w:t>27</w:t>
+              <w:t>1</w:t>
             </w:r>
           </w:p>
         </w:tc>
@@ -658,7 +725,7 @@
               <w:jc w:val="center"/>
             </w:pPr>
             <w:r>
-              <w:t>0</w:t>
+              <w:t>1</w:t>
             </w:r>
           </w:p>
         </w:tc>
@@ -699,7 +766,74 @@
               <w:jc w:val="center"/>
             </w:pPr>
             <w:r>
-              <w:t>DEV Worker</w:t>
+              <w:t>GPU Master</w:t>
+            </w:r>
+          </w:p>
+        </w:tc>
+        <w:tc>
+          <w:tcPr>
+            <w:tcW w:type="dxa" w:w="1728"/>
+          </w:tcPr>
+          <w:p>
+            <w:pPr>
+              <w:jc w:val="center"/>
+            </w:pPr>
+            <w:r>
+              <w:t>27</w:t>
+            </w:r>
+          </w:p>
+        </w:tc>
+        <w:tc>
+          <w:tcPr>
+            <w:tcW w:type="dxa" w:w="1728"/>
+          </w:tcPr>
+          <w:p>
+            <w:pPr>
+              <w:jc w:val="center"/>
+            </w:pPr>
+            <w:r>
+              <w:t>0</w:t>
+            </w:r>
+          </w:p>
+        </w:tc>
+        <w:tc>
+          <w:tcPr>
+            <w:tcW w:type="dxa" w:w="1728"/>
+          </w:tcPr>
+          <w:p>
+            <w:pPr>
+              <w:jc w:val="center"/>
+            </w:pPr>
+            <w:r>
+              <w:t>0</w:t>
+            </w:r>
+          </w:p>
+        </w:tc>
+        <w:tc>
+          <w:tcPr>
+            <w:tcW w:type="dxa" w:w="1728"/>
+          </w:tcPr>
+          <w:p>
+            <w:pPr>
+              <w:jc w:val="center"/>
+            </w:pPr>
+            <w:r>
+              <w:t>0</w:t>
+            </w:r>
+          </w:p>
+        </w:tc>
+      </w:tr>
+      <w:tr>
+        <w:tc>
+          <w:tcPr>
+            <w:tcW w:type="dxa" w:w="1728"/>
+          </w:tcPr>
+          <w:p>
+            <w:pPr>
+              <w:jc w:val="center"/>
+            </w:pPr>
+            <w:r>
+              <w:t>GPU Worker</w:t>
             </w:r>
           </w:p>
         </w:tc>
@@ -1575,7 +1709,456 @@
         <w:pStyle w:val="Heading2"/>
       </w:pPr>
       <w:r>
-        <w:t>4.1 인증서 환경</w:t>
+        <w:t>4.1 CI/CD 인프라 환경</w:t>
+      </w:r>
+    </w:p>
+    <w:p>
+      <w:pPr>
+        <w:pStyle w:val="Heading3"/>
+      </w:pPr>
+      <w:r>
+        <w:t>CI/CD</w:t>
+      </w:r>
+    </w:p>
+    <w:tbl>
+      <w:tblPr>
+        <w:tblStyle w:val="TableGrid"/>
+        <w:tblW w:type="auto" w:w="0"/>
+        <w:tblLook w:firstColumn="1" w:firstRow="1" w:lastColumn="0" w:lastRow="0" w:noHBand="0" w:noVBand="1" w:val="04A0"/>
+      </w:tblPr>
+      <w:tblGrid>
+        <w:gridCol w:w="1728"/>
+        <w:gridCol w:w="1728"/>
+        <w:gridCol w:w="1728"/>
+        <w:gridCol w:w="1728"/>
+        <w:gridCol w:w="1728"/>
+      </w:tblGrid>
+      <w:tr>
+        <w:tc>
+          <w:tcPr>
+            <w:tcW w:type="dxa" w:w="1728"/>
+          </w:tcPr>
+          <w:p>
+            <w:pPr>
+              <w:jc w:val="center"/>
+            </w:pPr>
+            <w:r>
+              <w:rPr>
+                <w:b/>
+              </w:rPr>
+              <w:t>점검ID</w:t>
+            </w:r>
+          </w:p>
+        </w:tc>
+        <w:tc>
+          <w:tcPr>
+            <w:tcW w:type="dxa" w:w="1728"/>
+          </w:tcPr>
+          <w:p>
+            <w:pPr>
+              <w:jc w:val="center"/>
+            </w:pPr>
+            <w:r>
+              <w:rPr>
+                <w:b/>
+              </w:rPr>
+              <w:t>점검항목</w:t>
+            </w:r>
+          </w:p>
+        </w:tc>
+        <w:tc>
+          <w:tcPr>
+            <w:tcW w:type="dxa" w:w="1728"/>
+          </w:tcPr>
+          <w:p>
+            <w:pPr>
+              <w:jc w:val="center"/>
+            </w:pPr>
+            <w:r>
+              <w:rPr>
+                <w:b/>
+              </w:rPr>
+              <w:t>상태</w:t>
+            </w:r>
+          </w:p>
+        </w:tc>
+        <w:tc>
+          <w:tcPr>
+            <w:tcW w:type="dxa" w:w="1728"/>
+          </w:tcPr>
+          <w:p>
+            <w:pPr>
+              <w:jc w:val="center"/>
+            </w:pPr>
+            <w:r>
+              <w:rPr>
+                <w:b/>
+              </w:rPr>
+              <w:t>측정값</w:t>
+            </w:r>
+          </w:p>
+        </w:tc>
+        <w:tc>
+          <w:tcPr>
+            <w:tcW w:type="dxa" w:w="1728"/>
+          </w:tcPr>
+          <w:p>
+            <w:pPr>
+              <w:jc w:val="center"/>
+            </w:pPr>
+            <w:r>
+              <w:rPr>
+                <w:b/>
+              </w:rPr>
+              <w:t>결과메시지</w:t>
+            </w:r>
+          </w:p>
+        </w:tc>
+      </w:tr>
+      <w:tr>
+        <w:tc>
+          <w:tcPr>
+            <w:tcW w:type="dxa" w:w="1728"/>
+          </w:tcPr>
+          <w:p>
+            <w:r>
+              <w:t>CICD-repo-Repository</w:t>
+            </w:r>
+          </w:p>
+        </w:tc>
+        <w:tc>
+          <w:tcPr>
+            <w:tcW w:type="dxa" w:w="1728"/>
+          </w:tcPr>
+          <w:p>
+            <w:r>
+              <w:t>Repository 서비스</w:t>
+            </w:r>
+          </w:p>
+        </w:tc>
+        <w:tc>
+          <w:tcPr>
+            <w:tcW w:type="dxa" w:w="1728"/>
+          </w:tcPr>
+          <w:p>
+            <w:r>
+              <w:rPr>
+                <w:b/>
+                <w:color w:val="FF0000"/>
+              </w:rPr>
+              <w:t>위험</w:t>
+            </w:r>
+          </w:p>
+        </w:tc>
+        <w:tc>
+          <w:tcPr>
+            <w:tcW w:type="dxa" w:w="1728"/>
+          </w:tcPr>
+          <w:p>
+            <w:r>
+              <w:t>연결 실패</w:t>
+            </w:r>
+          </w:p>
+        </w:tc>
+        <w:tc>
+          <w:tcPr>
+            <w:tcW w:type="dxa" w:w="1728"/>
+          </w:tcPr>
+          <w:p>
+            <w:r>
+              <w:t>서비스 응답 없음</w:t>
+            </w:r>
+          </w:p>
+        </w:tc>
+      </w:tr>
+      <w:tr>
+        <w:tc>
+          <w:tcPr>
+            <w:tcW w:type="dxa" w:w="1728"/>
+          </w:tcPr>
+          <w:p>
+            <w:r>
+              <w:t>CICD-nexus-Nexus_Web</w:t>
+            </w:r>
+          </w:p>
+        </w:tc>
+        <w:tc>
+          <w:tcPr>
+            <w:tcW w:type="dxa" w:w="1728"/>
+          </w:tcPr>
+          <w:p>
+            <w:r>
+              <w:t>Nexus Web 서비스</w:t>
+            </w:r>
+          </w:p>
+        </w:tc>
+        <w:tc>
+          <w:tcPr>
+            <w:tcW w:type="dxa" w:w="1728"/>
+          </w:tcPr>
+          <w:p>
+            <w:r>
+              <w:rPr>
+                <w:b/>
+                <w:color w:val="FF0000"/>
+              </w:rPr>
+              <w:t>위험</w:t>
+            </w:r>
+          </w:p>
+        </w:tc>
+        <w:tc>
+          <w:tcPr>
+            <w:tcW w:type="dxa" w:w="1728"/>
+          </w:tcPr>
+          <w:p>
+            <w:r>
+              <w:t>연결 실패</w:t>
+            </w:r>
+          </w:p>
+        </w:tc>
+        <w:tc>
+          <w:tcPr>
+            <w:tcW w:type="dxa" w:w="1728"/>
+          </w:tcPr>
+          <w:p>
+            <w:r>
+              <w:t>서비스 응답 없음</w:t>
+            </w:r>
+          </w:p>
+        </w:tc>
+      </w:tr>
+      <w:tr>
+        <w:tc>
+          <w:tcPr>
+            <w:tcW w:type="dxa" w:w="1728"/>
+          </w:tcPr>
+          <w:p>
+            <w:r>
+              <w:t>CICD-jenkins_primary-Jenkins</w:t>
+            </w:r>
+          </w:p>
+        </w:tc>
+        <w:tc>
+          <w:tcPr>
+            <w:tcW w:type="dxa" w:w="1728"/>
+          </w:tcPr>
+          <w:p>
+            <w:r>
+              <w:t>Jenkins 서비스</w:t>
+            </w:r>
+          </w:p>
+        </w:tc>
+        <w:tc>
+          <w:tcPr>
+            <w:tcW w:type="dxa" w:w="1728"/>
+          </w:tcPr>
+          <w:p>
+            <w:r>
+              <w:rPr>
+                <w:b/>
+                <w:color w:val="FF0000"/>
+              </w:rPr>
+              <w:t>위험</w:t>
+            </w:r>
+          </w:p>
+        </w:tc>
+        <w:tc>
+          <w:tcPr>
+            <w:tcW w:type="dxa" w:w="1728"/>
+          </w:tcPr>
+          <w:p>
+            <w:r>
+              <w:t>연결 실패</w:t>
+            </w:r>
+          </w:p>
+        </w:tc>
+        <w:tc>
+          <w:tcPr>
+            <w:tcW w:type="dxa" w:w="1728"/>
+          </w:tcPr>
+          <w:p>
+            <w:r>
+              <w:t>서비스 응답 없음</w:t>
+            </w:r>
+          </w:p>
+        </w:tc>
+      </w:tr>
+      <w:tr>
+        <w:tc>
+          <w:tcPr>
+            <w:tcW w:type="dxa" w:w="1728"/>
+          </w:tcPr>
+          <w:p>
+            <w:r>
+              <w:t>CICD-jenkins_secondary-Jenkins</w:t>
+            </w:r>
+          </w:p>
+        </w:tc>
+        <w:tc>
+          <w:tcPr>
+            <w:tcW w:type="dxa" w:w="1728"/>
+          </w:tcPr>
+          <w:p>
+            <w:r>
+              <w:t>Jenkins 서비스</w:t>
+            </w:r>
+          </w:p>
+        </w:tc>
+        <w:tc>
+          <w:tcPr>
+            <w:tcW w:type="dxa" w:w="1728"/>
+          </w:tcPr>
+          <w:p>
+            <w:r>
+              <w:rPr>
+                <w:b/>
+                <w:color w:val="FF0000"/>
+              </w:rPr>
+              <w:t>위험</w:t>
+            </w:r>
+          </w:p>
+        </w:tc>
+        <w:tc>
+          <w:tcPr>
+            <w:tcW w:type="dxa" w:w="1728"/>
+          </w:tcPr>
+          <w:p>
+            <w:r>
+              <w:t>연결 실패</w:t>
+            </w:r>
+          </w:p>
+        </w:tc>
+        <w:tc>
+          <w:tcPr>
+            <w:tcW w:type="dxa" w:w="1728"/>
+          </w:tcPr>
+          <w:p>
+            <w:r>
+              <w:t>서비스 응답 없음</w:t>
+            </w:r>
+          </w:p>
+        </w:tc>
+      </w:tr>
+      <w:tr>
+        <w:tc>
+          <w:tcPr>
+            <w:tcW w:type="dxa" w:w="1728"/>
+          </w:tcPr>
+          <w:p>
+            <w:r>
+              <w:t>CICD-gitlab_primary-GitLab</w:t>
+            </w:r>
+          </w:p>
+        </w:tc>
+        <w:tc>
+          <w:tcPr>
+            <w:tcW w:type="dxa" w:w="1728"/>
+          </w:tcPr>
+          <w:p>
+            <w:r>
+              <w:t>GitLab 서비스</w:t>
+            </w:r>
+          </w:p>
+        </w:tc>
+        <w:tc>
+          <w:tcPr>
+            <w:tcW w:type="dxa" w:w="1728"/>
+          </w:tcPr>
+          <w:p>
+            <w:r>
+              <w:rPr>
+                <w:b/>
+                <w:color w:val="FF0000"/>
+              </w:rPr>
+              <w:t>위험</w:t>
+            </w:r>
+          </w:p>
+        </w:tc>
+        <w:tc>
+          <w:tcPr>
+            <w:tcW w:type="dxa" w:w="1728"/>
+          </w:tcPr>
+          <w:p>
+            <w:r>
+              <w:t>연결 실패</w:t>
+            </w:r>
+          </w:p>
+        </w:tc>
+        <w:tc>
+          <w:tcPr>
+            <w:tcW w:type="dxa" w:w="1728"/>
+          </w:tcPr>
+          <w:p>
+            <w:r>
+              <w:t>서비스 응답 없음</w:t>
+            </w:r>
+          </w:p>
+        </w:tc>
+      </w:tr>
+      <w:tr>
+        <w:tc>
+          <w:tcPr>
+            <w:tcW w:type="dxa" w:w="1728"/>
+          </w:tcPr>
+          <w:p>
+            <w:r>
+              <w:t>CICD-gitlab_secondary-GitLab</w:t>
+            </w:r>
+          </w:p>
+        </w:tc>
+        <w:tc>
+          <w:tcPr>
+            <w:tcW w:type="dxa" w:w="1728"/>
+          </w:tcPr>
+          <w:p>
+            <w:r>
+              <w:t>GitLab 서비스</w:t>
+            </w:r>
+          </w:p>
+        </w:tc>
+        <w:tc>
+          <w:tcPr>
+            <w:tcW w:type="dxa" w:w="1728"/>
+          </w:tcPr>
+          <w:p>
+            <w:r>
+              <w:rPr>
+                <w:b/>
+                <w:color w:val="FF0000"/>
+              </w:rPr>
+              <w:t>위험</w:t>
+            </w:r>
+          </w:p>
+        </w:tc>
+        <w:tc>
+          <w:tcPr>
+            <w:tcW w:type="dxa" w:w="1728"/>
+          </w:tcPr>
+          <w:p>
+            <w:r>
+              <w:t>연결 실패</w:t>
+            </w:r>
+          </w:p>
+        </w:tc>
+        <w:tc>
+          <w:tcPr>
+            <w:tcW w:type="dxa" w:w="1728"/>
+          </w:tcPr>
+          <w:p>
+            <w:r>
+              <w:t>서비스 응답 없음</w:t>
+            </w:r>
+          </w:p>
+        </w:tc>
+      </w:tr>
+    </w:tbl>
+    <w:p/>
+    <w:p>
+      <w:pPr>
+        <w:pStyle w:val="Heading2"/>
+      </w:pPr>
+      <w:r>
+        <w:t>4.2 인증서 환경</w:t>
       </w:r>
     </w:p>
     <w:p>
@@ -1800,7 +2383,7 @@
         <w:pStyle w:val="Heading2"/>
       </w:pPr>
       <w:r>
-        <w:t>4.2 DEV 환경</w:t>
+        <w:t>4.3 GPU 환경</w:t>
       </w:r>
     </w:p>
     <w:p>
@@ -1808,7 +2391,7 @@
         <w:pStyle w:val="Heading3"/>
       </w:pPr>
       <w:r>
-        <w:t>DEV Master</w:t>
+        <w:t>GPU Master</w:t>
       </w:r>
     </w:p>
     <w:tbl>
@@ -1947,7 +2530,7 @@
           </w:tcPr>
           <w:p>
             <w:r>
-              <w:t>41</w:t>
+              <w:t>42</w:t>
             </w:r>
           </w:p>
         </w:tc>
@@ -2003,7 +2586,7 @@
           </w:tcPr>
           <w:p>
             <w:r>
-              <w:t>25.5</w:t>
+              <w:t>26.3</w:t>
             </w:r>
           </w:p>
         </w:tc>
@@ -2059,7 +2642,7 @@
           </w:tcPr>
           <w:p>
             <w:r>
-              <w:t>8</w:t>
+              <w:t>2</w:t>
             </w:r>
           </w:p>
         </w:tc>
@@ -2115,7 +2698,7 @@
           </w:tcPr>
           <w:p>
             <w:r>
-              <w:t>up 4 weeks, 4 days, 2 hours, 2...</w:t>
+              <w:t>up 4 weeks, 4 days, 6 hours, 1...</w:t>
             </w:r>
           </w:p>
         </w:tc>
@@ -2227,7 +2810,7 @@
           </w:tcPr>
           <w:p>
             <w:r>
-              <w:t>0.34</w:t>
+              <w:t>0.98</w:t>
             </w:r>
           </w:p>
         </w:tc>
@@ -2283,7 +2866,7 @@
           </w:tcPr>
           <w:p>
             <w:r>
-              <w:t>2752</w:t>
+              <w:t>2720</w:t>
             </w:r>
           </w:p>
         </w:tc>
@@ -2339,7 +2922,7 @@
           </w:tcPr>
           <w:p>
             <w:r>
-              <w:t>1160</w:t>
+              <w:t>1167</w:t>
             </w:r>
           </w:p>
         </w:tc>
@@ -2507,7 +3090,7 @@
           </w:tcPr>
           <w:p>
             <w:r>
-              <w:t>26.4</w:t>
+              <w:t>26.3</w:t>
             </w:r>
           </w:p>
         </w:tc>
@@ -2619,7 +3202,7 @@
           </w:tcPr>
           <w:p>
             <w:r>
-              <w:t>up 4 weeks, 4 days, 3 hours</w:t>
+              <w:t>up 4 weeks, 4 days, 6 hours, 4...</w:t>
             </w:r>
           </w:p>
         </w:tc>
@@ -2731,7 +3314,7 @@
           </w:tcPr>
           <w:p>
             <w:r>
-              <w:t>1.60</w:t>
+              <w:t>0.44</w:t>
             </w:r>
           </w:p>
         </w:tc>
@@ -2787,7 +3370,7 @@
           </w:tcPr>
           <w:p>
             <w:r>
-              <w:t>2656</w:t>
+              <w:t>2752</w:t>
             </w:r>
           </w:p>
         </w:tc>
@@ -2843,7 +3426,7 @@
           </w:tcPr>
           <w:p>
             <w:r>
-              <w:t>1180</w:t>
+              <w:t>1176</w:t>
             </w:r>
           </w:p>
         </w:tc>
@@ -3123,7 +3706,7 @@
           </w:tcPr>
           <w:p>
             <w:r>
-              <w:t>up 4 weeks, 4 days, 2 hours, 4...</w:t>
+              <w:t>up 4 weeks, 4 days, 6 hours, 2...</w:t>
             </w:r>
           </w:p>
         </w:tc>
@@ -3235,7 +3818,7 @@
           </w:tcPr>
           <w:p>
             <w:r>
-              <w:t>0.26</w:t>
+              <w:t>0.20</w:t>
             </w:r>
           </w:p>
         </w:tc>
@@ -3291,7 +3874,7 @@
           </w:tcPr>
           <w:p>
             <w:r>
-              <w:t>2720</w:t>
+              <w:t>2624</w:t>
             </w:r>
           </w:p>
         </w:tc>
@@ -3347,7 +3930,7 @@
           </w:tcPr>
           <w:p>
             <w:r>
-              <w:t>1172</w:t>
+              <w:t>1162</w:t>
             </w:r>
           </w:p>
         </w:tc>
@@ -3425,7 +4008,7 @@
         <w:pStyle w:val="Heading3"/>
       </w:pPr>
       <w:r>
-        <w:t>DEV Worker</w:t>
+        <w:t>GPU Worker</w:t>
       </w:r>
     </w:p>
     <w:tbl>
@@ -3620,7 +4203,7 @@
           </w:tcPr>
           <w:p>
             <w:r>
-              <w:t>22.0</w:t>
+              <w:t>20.9</w:t>
             </w:r>
           </w:p>
         </w:tc>
@@ -3676,7 +4259,7 @@
           </w:tcPr>
           <w:p>
             <w:r>
-              <w:t>2</w:t>
+              <w:t>4</w:t>
             </w:r>
           </w:p>
         </w:tc>
@@ -3732,7 +4315,7 @@
           </w:tcPr>
           <w:p>
             <w:r>
-              <w:t>up 1 day, 2 hours, 37 minutes</w:t>
+              <w:t>up 1 day, 6 hours, 23 minutes</w:t>
             </w:r>
           </w:p>
         </w:tc>
@@ -3844,7 +4427,7 @@
           </w:tcPr>
           <w:p>
             <w:r>
-              <w:t>1.61</w:t>
+              <w:t>0.53</w:t>
             </w:r>
           </w:p>
         </w:tc>
@@ -3900,7 +4483,7 @@
           </w:tcPr>
           <w:p>
             <w:r>
-              <w:t>12544</w:t>
+              <w:t>15072</w:t>
             </w:r>
           </w:p>
         </w:tc>
@@ -3956,7 +4539,7 @@
           </w:tcPr>
           <w:p>
             <w:r>
-              <w:t>43</w:t>
+              <w:t>42</w:t>
             </w:r>
           </w:p>
         </w:tc>
@@ -4124,7 +4707,7 @@
           </w:tcPr>
           <w:p>
             <w:r>
-              <w:t>51.5</w:t>
+              <w:t>50.4</w:t>
             </w:r>
           </w:p>
         </w:tc>
@@ -4180,7 +4763,7 @@
           </w:tcPr>
           <w:p>
             <w:r>
-              <w:t>9</w:t>
+              <w:t>4</w:t>
             </w:r>
           </w:p>
         </w:tc>
@@ -4236,7 +4819,7 @@
           </w:tcPr>
           <w:p>
             <w:r>
-              <w:t>up 4 weeks, 4 days, 4 hours, 1...</w:t>
+              <w:t>up 4 weeks, 4 days, 7 hours, 5...</w:t>
             </w:r>
           </w:p>
         </w:tc>
@@ -4348,7 +4931,7 @@
           </w:tcPr>
           <w:p>
             <w:r>
-              <w:t>1.91</w:t>
+              <w:t>1.09</w:t>
             </w:r>
           </w:p>
         </w:tc>
@@ -4404,7 +4987,7 @@
           </w:tcPr>
           <w:p>
             <w:r>
-              <w:t>6688</w:t>
+              <w:t>6656</w:t>
             </w:r>
           </w:p>
         </w:tc>
@@ -4628,7 +5211,7 @@
           </w:tcPr>
           <w:p>
             <w:r>
-              <w:t>26.3</w:t>
+              <w:t>25.4</w:t>
             </w:r>
           </w:p>
         </w:tc>
@@ -4684,7 +5267,7 @@
           </w:tcPr>
           <w:p>
             <w:r>
-              <w:t>14</w:t>
+              <w:t>6</w:t>
             </w:r>
           </w:p>
         </w:tc>
@@ -4740,7 +5323,7 @@
           </w:tcPr>
           <w:p>
             <w:r>
-              <w:t>up 1 day, 2 hours, 40 minutes</w:t>
+              <w:t>up 1 day, 6 hours, 26 minutes</w:t>
             </w:r>
           </w:p>
         </w:tc>
@@ -4852,7 +5435,7 @@
           </w:tcPr>
           <w:p>
             <w:r>
-              <w:t>2.02</w:t>
+              <w:t>1.08</w:t>
             </w:r>
           </w:p>
         </w:tc>
@@ -5239,7 +5822,7 @@
           </w:tcPr>
           <w:p>
             <w:r>
-              <w:t>gpu-master-01:6</w:t>
+              <w:t>gpu-master-01:7</w:t>
               <w:br/>
               <w:t>gpu-master-02:...</w:t>
             </w:r>
@@ -5297,7 +5880,7 @@
           </w:tcPr>
           <w:p>
             <w:r>
-              <w:t>gpu-master-01:28</w:t>
+              <w:t>gpu-master-01:29</w:t>
               <w:br/>
               <w:t>gpu-master-02...</w:t>
             </w:r>
@@ -5411,7 +5994,7 @@
           </w:tcPr>
           <w:p>
             <w:r>
-              <w:t>42</w:t>
+              <w:t>35</w:t>
             </w:r>
           </w:p>
         </w:tc>
@@ -8159,6 +8742,198 @@
       </w:pPr>
       <w:r>
         <w:t>5. 조치 필요 항목</w:t>
+      </w:r>
+    </w:p>
+    <w:p>
+      <w:r>
+        <w:rPr>
+          <w:b/>
+        </w:rPr>
+        <w:t>[위험] [CICD-repo-Repository] Repository 서비스</w:t>
+      </w:r>
+      <w:r>
+        <w:br/>
+        <w:t xml:space="preserve">   - 환경: CI/CD 인프라</w:t>
+      </w:r>
+      <w:r>
+        <w:br/>
+        <w:t xml:space="preserve">   - 대상: Repo 서버</w:t>
+      </w:r>
+      <w:r>
+        <w:br/>
+        <w:t xml:space="preserve">   - 상태: 위험</w:t>
+      </w:r>
+      <w:r>
+        <w:br/>
+        <w:t xml:space="preserve">   - 측정값: 연결 실패</w:t>
+      </w:r>
+      <w:r>
+        <w:br/>
+        <w:t xml:space="preserve">   - 메시지: 서비스 응답 없음</w:t>
+      </w:r>
+      <w:r>
+        <w:br/>
+        <w:t xml:space="preserve">   - 중요도: critical</w:t>
+      </w:r>
+    </w:p>
+    <w:p>
+      <w:r>
+        <w:rPr>
+          <w:b/>
+        </w:rPr>
+        <w:t>[위험] [CICD-nexus-Nexus_Web] Nexus Web 서비스</w:t>
+      </w:r>
+      <w:r>
+        <w:br/>
+        <w:t xml:space="preserve">   - 환경: CI/CD 인프라</w:t>
+      </w:r>
+      <w:r>
+        <w:br/>
+        <w:t xml:space="preserve">   - 대상: Nexus 서버</w:t>
+      </w:r>
+      <w:r>
+        <w:br/>
+        <w:t xml:space="preserve">   - 상태: 위험</w:t>
+      </w:r>
+      <w:r>
+        <w:br/>
+        <w:t xml:space="preserve">   - 측정값: 연결 실패</w:t>
+      </w:r>
+      <w:r>
+        <w:br/>
+        <w:t xml:space="preserve">   - 메시지: 서비스 응답 없음</w:t>
+      </w:r>
+      <w:r>
+        <w:br/>
+        <w:t xml:space="preserve">   - 중요도: critical</w:t>
+      </w:r>
+    </w:p>
+    <w:p>
+      <w:r>
+        <w:rPr>
+          <w:b/>
+        </w:rPr>
+        <w:t>[위험] [CICD-jenkins_primary-Jenkins] Jenkins 서비스</w:t>
+      </w:r>
+      <w:r>
+        <w:br/>
+        <w:t xml:space="preserve">   - 환경: CI/CD 인프라</w:t>
+      </w:r>
+      <w:r>
+        <w:br/>
+        <w:t xml:space="preserve">   - 대상: Jenkins #1 (Primary)</w:t>
+      </w:r>
+      <w:r>
+        <w:br/>
+        <w:t xml:space="preserve">   - 상태: 위험</w:t>
+      </w:r>
+      <w:r>
+        <w:br/>
+        <w:t xml:space="preserve">   - 측정값: 연결 실패</w:t>
+      </w:r>
+      <w:r>
+        <w:br/>
+        <w:t xml:space="preserve">   - 메시지: 서비스 응답 없음</w:t>
+      </w:r>
+      <w:r>
+        <w:br/>
+        <w:t xml:space="preserve">   - 중요도: critical</w:t>
+      </w:r>
+    </w:p>
+    <w:p>
+      <w:r>
+        <w:rPr>
+          <w:b/>
+        </w:rPr>
+        <w:t>[위험] [CICD-jenkins_secondary-Jenkins] Jenkins 서비스</w:t>
+      </w:r>
+      <w:r>
+        <w:br/>
+        <w:t xml:space="preserve">   - 환경: CI/CD 인프라</w:t>
+      </w:r>
+      <w:r>
+        <w:br/>
+        <w:t xml:space="preserve">   - 대상: Jenkins #2 (Backup)</w:t>
+      </w:r>
+      <w:r>
+        <w:br/>
+        <w:t xml:space="preserve">   - 상태: 위험</w:t>
+      </w:r>
+      <w:r>
+        <w:br/>
+        <w:t xml:space="preserve">   - 측정값: 연결 실패</w:t>
+      </w:r>
+      <w:r>
+        <w:br/>
+        <w:t xml:space="preserve">   - 메시지: 서비스 응답 없음</w:t>
+      </w:r>
+      <w:r>
+        <w:br/>
+        <w:t xml:space="preserve">   - 중요도: critical</w:t>
+      </w:r>
+    </w:p>
+    <w:p>
+      <w:r>
+        <w:rPr>
+          <w:b/>
+        </w:rPr>
+        <w:t>[위험] [CICD-gitlab_primary-GitLab] GitLab 서비스</w:t>
+      </w:r>
+      <w:r>
+        <w:br/>
+        <w:t xml:space="preserve">   - 환경: CI/CD 인프라</w:t>
+      </w:r>
+      <w:r>
+        <w:br/>
+        <w:t xml:space="preserve">   - 대상: GitLab #1</w:t>
+      </w:r>
+      <w:r>
+        <w:br/>
+        <w:t xml:space="preserve">   - 상태: 위험</w:t>
+      </w:r>
+      <w:r>
+        <w:br/>
+        <w:t xml:space="preserve">   - 측정값: 연결 실패</w:t>
+      </w:r>
+      <w:r>
+        <w:br/>
+        <w:t xml:space="preserve">   - 메시지: 서비스 응답 없음</w:t>
+      </w:r>
+      <w:r>
+        <w:br/>
+        <w:t xml:space="preserve">   - 중요도: critical</w:t>
+      </w:r>
+    </w:p>
+    <w:p>
+      <w:r>
+        <w:rPr>
+          <w:b/>
+        </w:rPr>
+        <w:t>[위험] [CICD-gitlab_secondary-GitLab] GitLab 서비스</w:t>
+      </w:r>
+      <w:r>
+        <w:br/>
+        <w:t xml:space="preserve">   - 환경: CI/CD 인프라</w:t>
+      </w:r>
+      <w:r>
+        <w:br/>
+        <w:t xml:space="preserve">   - 대상: GitLab #2</w:t>
+      </w:r>
+      <w:r>
+        <w:br/>
+        <w:t xml:space="preserve">   - 상태: 위험</w:t>
+      </w:r>
+      <w:r>
+        <w:br/>
+        <w:t xml:space="preserve">   - 측정값: 연결 실패</w:t>
+      </w:r>
+      <w:r>
+        <w:br/>
+        <w:t xml:space="preserve">   - 메시지: 서비스 응답 없음</w:t>
+      </w:r>
+      <w:r>
+        <w:br/>
+        <w:t xml:space="preserve">   - 중요도: critical</w:t>
       </w:r>
     </w:p>
     <w:p>
@@ -8202,11 +8977,11 @@
       </w:r>
       <w:r>
         <w:br/>
-        <w:t xml:space="preserve">   - 환경: DEV</w:t>
+        <w:t xml:space="preserve">   - 환경: GPU</w:t>
       </w:r>
       <w:r>
         <w:br/>
-        <w:t xml:space="preserve">   - 대상: DEV Services</w:t>
+        <w:t xml:space="preserve">   - 대상: GPU Services</w:t>
       </w:r>
       <w:r>
         <w:br/>
@@ -8234,11 +9009,11 @@
       </w:r>
       <w:r>
         <w:br/>
-        <w:t xml:space="preserve">   - 환경: DEV</w:t>
+        <w:t xml:space="preserve">   - 환경: GPU</w:t>
       </w:r>
       <w:r>
         <w:br/>
-        <w:t xml:space="preserve">   - 대상: DEV Apps</w:t>
+        <w:t xml:space="preserve">   - 대상: GPU Apps</w:t>
       </w:r>
       <w:r>
         <w:br/>
@@ -8266,11 +9041,11 @@
       </w:r>
       <w:r>
         <w:br/>
-        <w:t xml:space="preserve">   - 환경: DEV</w:t>
+        <w:t xml:space="preserve">   - 환경: GPU</w:t>
       </w:r>
       <w:r>
         <w:br/>
-        <w:t xml:space="preserve">   - 대상: DEV Apps</w:t>
+        <w:t xml:space="preserve">   - 대상: GPU Apps</w:t>
       </w:r>
       <w:r>
         <w:br/>
@@ -8298,11 +9073,11 @@
       </w:r>
       <w:r>
         <w:br/>
-        <w:t xml:space="preserve">   - 환경: DEV</w:t>
+        <w:t xml:space="preserve">   - 환경: GPU</w:t>
       </w:r>
       <w:r>
         <w:br/>
-        <w:t xml:space="preserve">   - 대상: DEV Apps</w:t>
+        <w:t xml:space="preserve">   - 대상: GPU Apps</w:t>
       </w:r>
       <w:r>
         <w:br/>
@@ -8330,11 +9105,11 @@
       </w:r>
       <w:r>
         <w:br/>
-        <w:t xml:space="preserve">   - 환경: DEV</w:t>
+        <w:t xml:space="preserve">   - 환경: GPU</w:t>
       </w:r>
       <w:r>
         <w:br/>
-        <w:t xml:space="preserve">   - 대상: DEV Cluster</w:t>
+        <w:t xml:space="preserve">   - 대상: GPU Cluster</w:t>
       </w:r>
       <w:r>
         <w:br/>
@@ -8362,11 +9137,11 @@
       </w:r>
       <w:r>
         <w:br/>
-        <w:t xml:space="preserve">   - 환경: DEV</w:t>
+        <w:t xml:space="preserve">   - 환경: GPU</w:t>
       </w:r>
       <w:r>
         <w:br/>
-        <w:t xml:space="preserve">   - 대상: DEV Cluster</w:t>
+        <w:t xml:space="preserve">   - 대상: GPU Cluster</w:t>
       </w:r>
       <w:r>
         <w:br/>

</xml_diff>